<commit_message>
feat: update Venticano Teatro Festival program with a new performance on August 26 and finalize ticket pricing details
</commit_message>
<xml_diff>
--- a/social-caroselli-testi.docx
+++ b/social-caroselli-testi.docx
@@ -923,6 +923,28 @@
           <w:b/>
           <w:bCs/>
         </w:rPr>
+        <w:t xml:space="preserve">26 AGO</w:t>
+      </w:r>
+      <w:r>
+        <w:t xml:space="preserve"> </w:t>
+      </w:r>
+      <w:r>
+        <w:t xml:space="preserve">| Spettacolo Teatrale (da definire)</w:t>
+      </w:r>
+    </w:p>
+    <w:p>
+      <w:pPr>
+        <w:pStyle w:val="Compact"/>
+        <w:numPr>
+          <w:ilvl w:val="1"/>
+          <w:numId w:val="1010"/>
+        </w:numPr>
+      </w:pPr>
+      <w:r>
+        <w:rPr>
+          <w:b/>
+          <w:bCs/>
+        </w:rPr>
         <w:t xml:space="preserve">28 AGO</w:t>
       </w:r>
       <w:r>
@@ -1207,13 +1229,13 @@
       </w:r>
     </w:p>
     <w:bookmarkEnd w:id="15"/>
-    <w:bookmarkStart w:id="16" w:name="slide-7-i-luoghi-symbolo"/>
+    <w:bookmarkStart w:id="16" w:name="slide-7-i-luoghi-simbolo"/>
     <w:p>
       <w:pPr>
         <w:pStyle w:val="Heading3"/>
       </w:pPr>
       <w:r>
-        <w:t xml:space="preserve">Slide 7: I Luoghi Symbolo</w:t>
+        <w:t xml:space="preserve">Slide 7: I Luoghi Simbolo</w:t>
       </w:r>
     </w:p>
     <w:p>
@@ -1878,7 +1900,7 @@
         <w:t xml:space="preserve">Gran Galà dell’Opera Lirica</w:t>
       </w:r>
       <w:r>
-        <w:t xml:space="preserve">. Le arie più famose della lirica sotto le stelle.</w:t>
+        <w:t xml:space="preserve">. Le arie celebri sotto le stelle.</w:t>
       </w:r>
     </w:p>
     <w:p>
@@ -1919,7 +1941,7 @@
         <w:t xml:space="preserve">“Nu Bambeniello e tre San Giuseppe”</w:t>
       </w:r>
       <w:r>
-        <w:t xml:space="preserve">. Classica e divertentissima commedia napoletana con</w:t>
+        <w:t xml:space="preserve">. Commedia napoletana con</w:t>
       </w:r>
       <w:r>
         <w:t xml:space="preserve"> </w:t>
@@ -1976,6 +1998,50 @@
         <w:t xml:space="preserve">. Festival del Cinema Indipendente.</w:t>
       </w:r>
     </w:p>
+    <w:p>
+      <w:pPr>
+        <w:pStyle w:val="Compact"/>
+        <w:numPr>
+          <w:ilvl w:val="1"/>
+          <w:numId w:val="1021"/>
+        </w:numPr>
+      </w:pPr>
+      <w:r>
+        <w:rPr>
+          <w:b/>
+          <w:bCs/>
+        </w:rPr>
+        <w:t xml:space="preserve">Mercoledì 26 Agosto</w:t>
+      </w:r>
+      <w:r>
+        <w:t xml:space="preserve"> </w:t>
+      </w:r>
+      <w:r>
+        <w:t xml:space="preserve">| Ore 21:00</w:t>
+      </w:r>
+      <w:r>
+        <w:t xml:space="preserve"> </w:t>
+      </w:r>
+      <w:r>
+        <w:t xml:space="preserve">👉</w:t>
+      </w:r>
+      <w:r>
+        <w:t xml:space="preserve"> </w:t>
+      </w:r>
+      <w:r>
+        <w:rPr>
+          <w:b/>
+          <w:bCs/>
+        </w:rPr>
+        <w:t xml:space="preserve">Spettacolo Teatrale</w:t>
+      </w:r>
+      <w:r>
+        <w:t xml:space="preserve"> </w:t>
+      </w:r>
+      <w:r>
+        <w:t xml:space="preserve">(a pagamento - in via di definizione).</w:t>
+      </w:r>
+    </w:p>
     <w:bookmarkEnd w:id="21"/>
     <w:bookmarkStart w:id="22" w:name="slide-4-il-cartellone-di-settembre"/>
     <w:p>
@@ -2207,67 +2273,17 @@
         <w:t xml:space="preserve"> </w:t>
       </w:r>
       <w:r>
-        <w:t xml:space="preserve">(Tutti gli spettacoli):</w:t>
-      </w:r>
-      <w:r>
-        <w:t xml:space="preserve"> </w:t>
-      </w:r>
-      <w:r>
-        <w:rPr>
-          <w:b/>
-          <w:bCs/>
-        </w:rPr>
-        <w:t xml:space="preserve">€ [Prezzo]</w:t>
-      </w:r>
-    </w:p>
-    <w:p>
-      <w:pPr>
-        <w:pStyle w:val="Compact"/>
-        <w:numPr>
-          <w:ilvl w:val="1"/>
-          <w:numId w:val="1025"/>
-        </w:numPr>
-      </w:pPr>
-      <w:r>
-        <w:t xml:space="preserve">🎟️</w:t>
-      </w:r>
-      <w:r>
-        <w:t xml:space="preserve"> </w:t>
-      </w:r>
-      <w:r>
-        <w:rPr>
-          <w:b/>
-          <w:bCs/>
-        </w:rPr>
-        <w:t xml:space="preserve">Biglietti Singoli</w:t>
-      </w:r>
-      <w:r>
-        <w:t xml:space="preserve"> </w:t>
-      </w:r>
-      <w:r>
-        <w:t xml:space="preserve">a partire da</w:t>
-      </w:r>
-      <w:r>
-        <w:t xml:space="preserve"> </w:t>
-      </w:r>
-      <w:r>
-        <w:rPr>
-          <w:b/>
-          <w:bCs/>
-        </w:rPr>
-        <w:t xml:space="preserve">€ [Prezzo]</w:t>
-      </w:r>
-    </w:p>
-    <w:p>
-      <w:pPr>
-        <w:pStyle w:val="Compact"/>
-        <w:numPr>
-          <w:ilvl w:val="1"/>
-          <w:numId w:val="1025"/>
-        </w:numPr>
-      </w:pPr>
-      <w:r>
-        <w:t xml:space="preserve">🎟️</w:t>
+        <w:t xml:space="preserve">(tutti gli spettacoli a pag.):</w:t>
+      </w:r>
+      <w:r>
+        <w:t xml:space="preserve"> </w:t>
+      </w:r>
+      <w:r>
+        <w:rPr>
+          <w:b/>
+          <w:bCs/>
+        </w:rPr>
+        <w:t xml:space="preserve">€ 35,00</w:t>
       </w:r>
       <w:r>
         <w:t xml:space="preserve"> </w:t>
@@ -2277,7 +2293,122 @@
           <w:i/>
           <w:iCs/>
         </w:rPr>
-        <w:t xml:space="preserve">inVenticano, Corto e a Capo e Teatro Amatoriale sono ad ingresso gratuito.</w:t>
+        <w:t xml:space="preserve">(33€ + 2€ prev.)</w:t>
+      </w:r>
+    </w:p>
+    <w:p>
+      <w:pPr>
+        <w:pStyle w:val="Compact"/>
+        <w:numPr>
+          <w:ilvl w:val="1"/>
+          <w:numId w:val="1025"/>
+        </w:numPr>
+      </w:pPr>
+      <w:r>
+        <w:t xml:space="preserve">🎟️</w:t>
+      </w:r>
+      <w:r>
+        <w:t xml:space="preserve"> </w:t>
+      </w:r>
+      <w:r>
+        <w:rPr>
+          <w:b/>
+          <w:bCs/>
+        </w:rPr>
+        <w:t xml:space="preserve">Paolo Caizzo / M. Casagrande / Spettacolo 26 Ago</w:t>
+      </w:r>
+      <w:r>
+        <w:t xml:space="preserve">:</w:t>
+      </w:r>
+      <w:r>
+        <w:t xml:space="preserve"> </w:t>
+      </w:r>
+      <w:r>
+        <w:rPr>
+          <w:b/>
+          <w:bCs/>
+        </w:rPr>
+        <w:t xml:space="preserve">€ 12,00</w:t>
+      </w:r>
+      <w:r>
+        <w:t xml:space="preserve"> </w:t>
+      </w:r>
+      <w:r>
+        <w:rPr>
+          <w:i/>
+          <w:iCs/>
+        </w:rPr>
+        <w:t xml:space="preserve">(11€ + 1€ prev.)</w:t>
+      </w:r>
+    </w:p>
+    <w:p>
+      <w:pPr>
+        <w:pStyle w:val="Compact"/>
+        <w:numPr>
+          <w:ilvl w:val="1"/>
+          <w:numId w:val="1025"/>
+        </w:numPr>
+      </w:pPr>
+      <w:r>
+        <w:t xml:space="preserve">🎟️</w:t>
+      </w:r>
+      <w:r>
+        <w:t xml:space="preserve"> </w:t>
+      </w:r>
+      <w:r>
+        <w:rPr>
+          <w:b/>
+          <w:bCs/>
+        </w:rPr>
+        <w:t xml:space="preserve">Gran Galà dell’Opera Lirica</w:t>
+      </w:r>
+      <w:r>
+        <w:t xml:space="preserve"> </w:t>
+      </w:r>
+      <w:r>
+        <w:t xml:space="preserve">(6 Ago):</w:t>
+      </w:r>
+      <w:r>
+        <w:t xml:space="preserve"> </w:t>
+      </w:r>
+      <w:r>
+        <w:rPr>
+          <w:b/>
+          <w:bCs/>
+        </w:rPr>
+        <w:t xml:space="preserve">€ 8,00</w:t>
+      </w:r>
+      <w:r>
+        <w:t xml:space="preserve"> </w:t>
+      </w:r>
+      <w:r>
+        <w:rPr>
+          <w:i/>
+          <w:iCs/>
+        </w:rPr>
+        <w:t xml:space="preserve">(7€ + 1€ prev.)</w:t>
+      </w:r>
+    </w:p>
+    <w:p>
+      <w:pPr>
+        <w:pStyle w:val="Compact"/>
+        <w:numPr>
+          <w:ilvl w:val="1"/>
+          <w:numId w:val="1025"/>
+        </w:numPr>
+      </w:pPr>
+      <w:r>
+        <w:t xml:space="preserve">🆓</w:t>
+      </w:r>
+      <w:r>
+        <w:t xml:space="preserve"> </w:t>
+      </w:r>
+      <w:r>
+        <w:rPr>
+          <w:i/>
+          <w:iCs/>
+        </w:rPr>
+        <w:t xml:space="preserve">inVenticano, Nu Bambeniello, Corto e a Capo e Teatro Amatoriale sono ad ingresso gratuito.</w:t>
       </w:r>
     </w:p>
     <w:bookmarkEnd w:id="23"/>

</xml_diff>

<commit_message>
fix: update ticket pricing and details for the August 26th theater show across all event documentation
</commit_message>
<xml_diff>
--- a/social-caroselli-testi.docx
+++ b/social-caroselli-testi.docx
@@ -2315,7 +2315,7 @@
           <w:b/>
           <w:bCs/>
         </w:rPr>
-        <w:t xml:space="preserve">Paolo Caizzo / M. Casagrande / Spettacolo 26 Ago</w:t>
+        <w:t xml:space="preserve">Paolo Caizzo / M. Casagrande</w:t>
       </w:r>
       <w:r>
         <w:t xml:space="preserve">:</w:t>
@@ -2339,6 +2339,54 @@
           <w:iCs/>
         </w:rPr>
         <w:t xml:space="preserve">(11€ + 1€ prev.)</w:t>
+      </w:r>
+    </w:p>
+    <w:p>
+      <w:pPr>
+        <w:pStyle w:val="Compact"/>
+        <w:numPr>
+          <w:ilvl w:val="1"/>
+          <w:numId w:val="1025"/>
+        </w:numPr>
+      </w:pPr>
+      <w:r>
+        <w:t xml:space="preserve">🎟️</w:t>
+      </w:r>
+      <w:r>
+        <w:t xml:space="preserve"> </w:t>
+      </w:r>
+      <w:r>
+        <w:rPr>
+          <w:b/>
+          <w:bCs/>
+        </w:rPr>
+        <w:t xml:space="preserve">Spettacolo del 26 Agosto</w:t>
+      </w:r>
+      <w:r>
+        <w:t xml:space="preserve"> </w:t>
+      </w:r>
+      <w:r>
+        <w:t xml:space="preserve">(in via di def.):</w:t>
+      </w:r>
+      <w:r>
+        <w:t xml:space="preserve"> </w:t>
+      </w:r>
+      <w:r>
+        <w:rPr>
+          <w:b/>
+          <w:bCs/>
+        </w:rPr>
+        <w:t xml:space="preserve">€ 10,00</w:t>
+      </w:r>
+      <w:r>
+        <w:t xml:space="preserve"> </w:t>
+      </w:r>
+      <w:r>
+        <w:rPr>
+          <w:i/>
+          <w:iCs/>
+        </w:rPr>
+        <w:t xml:space="preserve">(9€ + 1€ prev.)</w:t>
       </w:r>
     </w:p>
     <w:p>

</xml_diff>

<commit_message>
feat: add final graphic assets and update event schedule with Grisù Giuseppe e Maria details
</commit_message>
<xml_diff>
--- a/social-caroselli-testi.docx
+++ b/social-caroselli-testi.docx
@@ -1071,7 +1071,19 @@
         <w:t xml:space="preserve"> </w:t>
       </w:r>
       <w:r>
-        <w:t xml:space="preserve">| Teatro Amatoriale</w:t>
+        <w:t xml:space="preserve">|</w:t>
+      </w:r>
+      <w:r>
+        <w:t xml:space="preserve"> </w:t>
+      </w:r>
+      <w:r>
+        <w:t xml:space="preserve">“Grisù Giuseppe e Maria”</w:t>
+      </w:r>
+      <w:r>
+        <w:t xml:space="preserve"> </w:t>
+      </w:r>
+      <w:r>
+        <w:t xml:space="preserve">(Teatro Amatoriale)</w:t>
       </w:r>
     </w:p>
     <w:p>
@@ -2131,10 +2143,19 @@
           <w:b/>
           <w:bCs/>
         </w:rPr>
-        <w:t xml:space="preserve">Teato Amatoriale</w:t>
-      </w:r>
-      <w:r>
-        <w:t xml:space="preserve">. Serata con le compagnie del territorio.</w:t>
+        <w:t xml:space="preserve">“Grisù Giuseppe e Maria”</w:t>
+      </w:r>
+      <w:r>
+        <w:t xml:space="preserve">. Commedia con la Compagnia Amatoriale</w:t>
+      </w:r>
+      <w:r>
+        <w:t xml:space="preserve"> </w:t>
+      </w:r>
+      <w:r>
+        <w:t xml:space="preserve">“ATTORI IN CORSO”</w:t>
+      </w:r>
+      <w:r>
+        <w:t xml:space="preserve">.</w:t>
       </w:r>
     </w:p>
     <w:p>
@@ -2456,7 +2477,35 @@
           <w:i/>
           <w:iCs/>
         </w:rPr>
-        <w:t xml:space="preserve">inVenticano, Nu Bambeniello, Corto e a Capo e Teatro Amatoriale sono ad ingresso gratuito.</w:t>
+        <w:t xml:space="preserve">inVenticano, Nu Bambeniello, Corto e a Capo e</w:t>
+      </w:r>
+      <w:r>
+        <w:rPr>
+          <w:i/>
+          <w:iCs/>
+        </w:rPr>
+        <w:t xml:space="preserve"> </w:t>
+      </w:r>
+      <w:r>
+        <w:rPr>
+          <w:i/>
+          <w:iCs/>
+        </w:rPr>
+        <w:t xml:space="preserve">“Grisù Giuseppe e Maria”</w:t>
+      </w:r>
+      <w:r>
+        <w:rPr>
+          <w:i/>
+          <w:iCs/>
+        </w:rPr>
+        <w:t xml:space="preserve"> </w:t>
+      </w:r>
+      <w:r>
+        <w:rPr>
+          <w:i/>
+          <w:iCs/>
+        </w:rPr>
+        <w:t xml:space="preserve">sono ad ingresso gratuito.</w:t>
       </w:r>
     </w:p>
     <w:bookmarkEnd w:id="23"/>

</xml_diff>